<commit_message>
build: regenerate reports for updated architecture
</commit_message>
<xml_diff>
--- a/docs/part1/report.docx
+++ b/docs/part1/report.docx
@@ -709,7 +709,7 @@
                 <w:b w:val="0"/>
                 <w:sz w:val="22"/>
               </w:rPr>
-              <w:t>ID, имя, email, хеш пароля, набор ролей, статус проверки и блокировки</w:t>
+              <w:t>ID, имя, email, хеш пароля, набор ролей, статус проверки и блокировки, версия токенов</w:t>
             </w:r>
           </w:p>
         </w:tc>
@@ -756,7 +756,7 @@
                 <w:b w:val="0"/>
                 <w:sz w:val="22"/>
               </w:rPr>
-              <w:t>Верификация</w:t>
+              <w:t>Токен обновления</w:t>
             </w:r>
           </w:p>
         </w:tc>
@@ -777,7 +777,7 @@
                 <w:b w:val="0"/>
                 <w:sz w:val="22"/>
               </w:rPr>
-              <w:t>Пользователь, дата подачи, решение, причина, модератор</w:t>
+              <w:t>Пользователь, хеш токена, срок действия, отметка отзыва</w:t>
             </w:r>
           </w:p>
         </w:tc>
@@ -798,7 +798,7 @@
                 <w:b w:val="0"/>
                 <w:sz w:val="22"/>
               </w:rPr>
-              <w:t>История рассмотрения профиля</w:t>
+              <w:t>Обновление доступа и завершение авторизации</w:t>
             </w:r>
           </w:p>
         </w:tc>
@@ -824,7 +824,7 @@
                 <w:b w:val="0"/>
                 <w:sz w:val="22"/>
               </w:rPr>
-              <w:t>Подписка</w:t>
+              <w:t>Верификация</w:t>
             </w:r>
           </w:p>
         </w:tc>
@@ -845,7 +845,7 @@
                 <w:b w:val="0"/>
                 <w:sz w:val="22"/>
               </w:rPr>
-              <w:t>Пользователь, начало и окончание, статус, оплаченный тариф</w:t>
+              <w:t>Пользователь, дата подачи, решение, причина, модератор</w:t>
             </w:r>
           </w:p>
         </w:tc>
@@ -866,7 +866,7 @@
                 <w:b w:val="0"/>
                 <w:sz w:val="22"/>
               </w:rPr>
-              <w:t>Проверка права доступа</w:t>
+              <w:t>История рассмотрения профиля</w:t>
             </w:r>
           </w:p>
         </w:tc>
@@ -892,7 +892,7 @@
                 <w:b w:val="0"/>
                 <w:sz w:val="22"/>
               </w:rPr>
-              <w:t>Платёж</w:t>
+              <w:t>Подписка</w:t>
             </w:r>
           </w:p>
         </w:tc>
@@ -913,7 +913,7 @@
                 <w:b w:val="0"/>
                 <w:sz w:val="22"/>
               </w:rPr>
-              <w:t>ID операции, сумма, статус, внешний идентификатор</w:t>
+              <w:t>Пользователь, начало и окончание, статус, оплаченный тариф</w:t>
             </w:r>
           </w:p>
         </w:tc>
@@ -934,7 +934,7 @@
                 <w:b w:val="0"/>
                 <w:sz w:val="22"/>
               </w:rPr>
-              <w:t>Связь оплаты с подпиской</w:t>
+              <w:t>Проверка права доступа</w:t>
             </w:r>
           </w:p>
         </w:tc>
@@ -960,7 +960,7 @@
                 <w:b w:val="0"/>
                 <w:sz w:val="22"/>
               </w:rPr>
-              <w:t>Объявление</w:t>
+              <w:t>Платёж</w:t>
             </w:r>
           </w:p>
         </w:tc>
@@ -981,7 +981,7 @@
                 <w:b w:val="0"/>
                 <w:sz w:val="22"/>
               </w:rPr>
-              <w:t>Тип, автор, категория, описание, время, место, статус</w:t>
+              <w:t>ID операции, сумма, статус, внешний идентификатор</w:t>
             </w:r>
           </w:p>
         </w:tc>
@@ -1002,7 +1002,7 @@
                 <w:b w:val="0"/>
                 <w:sz w:val="22"/>
               </w:rPr>
-              <w:t>Учёт потери или находки</w:t>
+              <w:t>Связь оплаты с подпиской</w:t>
             </w:r>
           </w:p>
         </w:tc>
@@ -1028,6 +1028,74 @@
                 <w:b w:val="0"/>
                 <w:sz w:val="22"/>
               </w:rPr>
+              <w:t>Объявление</w:t>
+            </w:r>
+          </w:p>
+        </w:tc>
+        <w:tc>
+          <w:tcPr>
+            <w:tcW w:type="dxa" w:w="2993"/>
+          </w:tcPr>
+          <w:p>
+            <w:pPr>
+              <w:keepNext w:val="0"/>
+              <w:spacing w:line="240" w:lineRule="auto" w:after="80" w:before="60"/>
+              <w:ind w:firstLine="0"/>
+              <w:jc w:val="left"/>
+            </w:pPr>
+            <w:r>
+              <w:rPr>
+                <w:rFonts w:ascii="Times New Roman" w:hAnsi="Times New Roman"/>
+                <w:b w:val="0"/>
+                <w:sz w:val="22"/>
+              </w:rPr>
+              <w:t>Тип, автор, категория, описание, время, место, статус</w:t>
+            </w:r>
+          </w:p>
+        </w:tc>
+        <w:tc>
+          <w:tcPr>
+            <w:tcW w:type="dxa" w:w="3742"/>
+          </w:tcPr>
+          <w:p>
+            <w:pPr>
+              <w:keepNext w:val="0"/>
+              <w:spacing w:line="240" w:lineRule="auto" w:after="80" w:before="60"/>
+              <w:ind w:firstLine="0"/>
+              <w:jc w:val="left"/>
+            </w:pPr>
+            <w:r>
+              <w:rPr>
+                <w:rFonts w:ascii="Times New Roman" w:hAnsi="Times New Roman"/>
+                <w:b w:val="0"/>
+                <w:sz w:val="22"/>
+              </w:rPr>
+              <w:t>Учёт потери или находки</w:t>
+            </w:r>
+          </w:p>
+        </w:tc>
+      </w:tr>
+      <w:tr>
+        <w:trPr>
+          <w:cantSplit/>
+        </w:trPr>
+        <w:tc>
+          <w:tcPr>
+            <w:tcW w:type="dxa" w:w="2619"/>
+          </w:tcPr>
+          <w:p>
+            <w:pPr>
+              <w:keepNext w:val="0"/>
+              <w:spacing w:line="240" w:lineRule="auto" w:after="80" w:before="60"/>
+              <w:ind w:firstLine="0"/>
+              <w:jc w:val="left"/>
+            </w:pPr>
+            <w:r>
+              <w:rPr>
+                <w:rFonts w:ascii="Times New Roman" w:hAnsi="Times New Roman"/>
+                <w:b w:val="0"/>
+                <w:sz w:val="22"/>
+              </w:rPr>
               <w:t>Фотография</w:t>
             </w:r>
           </w:p>
@@ -1049,7 +1117,7 @@
                 <w:b w:val="0"/>
                 <w:sz w:val="22"/>
               </w:rPr>
-              <w:t>Объявление, путь файла, MIME, размер, доступность</w:t>
+              <w:t>Объявление, ключ объекта MinIO, MIME, размер, доступность</w:t>
             </w:r>
           </w:p>
         </w:tc>
@@ -2261,7 +2329,7 @@
                 <w:b w:val="0"/>
                 <w:sz w:val="22"/>
               </w:rPr>
-              <w:t>Неподтверждённая почта не даёт пройти проверку; ссылка одноразовая и ограничена по времени</w:t>
+              <w:t>Неподтверждённая почта не даёт пройти проверку; ссылка одноразовая; после выхода refresh-токен отозван, при смене пароля прежние токены аннулированы</w:t>
             </w:r>
           </w:p>
         </w:tc>
@@ -4330,7 +4398,7 @@
                 <w:b w:val="0"/>
                 <w:sz w:val="22"/>
               </w:rPr>
-              <w:t>Контроль доступа и защита сессий</w:t>
+              <w:t>Контроль доступа и защита токенов</w:t>
             </w:r>
           </w:p>
         </w:tc>
@@ -4351,7 +4419,7 @@
                 <w:b w:val="0"/>
                 <w:sz w:val="22"/>
               </w:rPr>
-              <w:t>Авторизация проверяется сервером для каждой операции; пароли хешируются BCrypt; Cookie HttpOnly и SameSite, CSRF-защита; в HTTPS-режиме Cookie Secure</w:t>
+              <w:t>Spring Security проверяет JWT, роль и состояние пользователя для каждой операции; пароли хешируются BCrypt; refresh-токен передаётся в Cookie HttpOnly и SameSite, в HTTPS-режиме Secure; операции с Cookie защищаются от CSRF</w:t>
             </w:r>
           </w:p>
         </w:tc>
@@ -4895,7 +4963,7 @@
                 <w:b w:val="0"/>
                 <w:sz w:val="22"/>
               </w:rPr>
-              <w:t>Выпуск собирается Maven Wrapper, запускается обычным пользователем без root, Docker и обязательного Node.js на helios; секреты и пути вынесены из кода</w:t>
+              <w:t>Backend собирается Gradle Wrapper, frontend — pnpm на локальной машине; JAR и статический frontend запускаются на helios обычным пользователем без обязательных Docker и Node.js; PostgreSQL и MinIO доступны по настраиваемым адресам</w:t>
             </w:r>
           </w:p>
         </w:tc>
@@ -7309,7 +7377,7 @@
               </w:rPr>
               <w:t>1. Пользователь вводит email и пароль.</w:t>
               <w:br/>
-              <w:t>2. Система проверяет пароль и ограничения попыток, создаёт сессию.</w:t>
+              <w:t>2. Система проверяет пароль и ограничения попыток, выдаёт access-токен JWT и refresh-токен.</w:t>
               <w:br/>
               <w:t>3. Кабинет показывает статус проверки и подписки, разрешённые операции.</w:t>
             </w:r>
@@ -7358,7 +7426,7 @@
                 <w:b w:val="0"/>
                 <w:sz w:val="22"/>
               </w:rPr>
-              <w:t>Расширение «Восстановить пароль»: при утрате пароля пользователь запрашивает ссылку; система отвечает без раскрытия наличия аккаунта, выдаёт токен на 30 минут и отправляет письмо. По действующей ссылке пользователь задаёт новый пароль; токен погашается, прежние сессии закрываются.</w:t>
+              <w:t>Расширение «Восстановить пароль»: при утрате пароля пользователь запрашивает ссылку; система отвечает без раскрытия наличия аккаунта, выдаёт токен на 30 минут и отправляет письмо. По действующей ссылке пользователь задаёт новый пароль; токен погашается, прежние refresh-токены отзываются, версия токенов пользователя изменяется для аннулирования ранее выданных JWT.</w:t>
               <w:br/>
               <w:t>Неверные данные — общий отказ; превышение лимита — временное ограничение. Заблокированный аккаунт может просматривать причину и обращаться по своему делу, но пользовательские действия закрыты.</w:t>
             </w:r>
@@ -7407,7 +7475,7 @@
                 <w:b w:val="0"/>
                 <w:sz w:val="22"/>
               </w:rPr>
-              <w:t>Создана сессия либо дан контролируемый отказ.</w:t>
+              <w:t>Выданы токены доступа либо дан контролируемый отказ.</w:t>
             </w:r>
           </w:p>
         </w:tc>
@@ -14773,7 +14841,7 @@
         <w:rPr>
           <w:b w:val="0"/>
         </w:rPr>
-        <w:t>Система строится как модульный монолит с серверным формированием HTML. Приложение запускается в одном процессе, а связанные операции выполняются в общих транзакциях. Интерфейс реализуется средствами Spring MVC и Thymeleaf; JavaScript используется для обновления ставок и работы с формами. Выбранный стек соответствует допустимым технологиям курсовой работы.</w:t>
+        <w:t>Система использует клиент-серверную архитектуру с отдельным frontend и монолитным backend. Интерфейс на Next.js и TypeScript взаимодействует с REST API Spring MVC; Redux Toolkit хранит состояние интерфейса. Backend разделён на модули предметной области, выполняет проверки доступа и управляет транзакциями. Технологии выбраны на основе состава зависимостей MyFilmList в указанной версии проекта [7, 8].</w:t>
       </w:r>
     </w:p>
     <w:tbl>
@@ -14833,7 +14901,7 @@
                 <w:b/>
                 <w:sz w:val="22"/>
               </w:rPr>
-              <w:t>Предлагаемая технология</w:t>
+              <w:t>Технологии</w:t>
             </w:r>
           </w:p>
         </w:tc>
@@ -14855,7 +14923,7 @@
                 <w:b/>
                 <w:sz w:val="22"/>
               </w:rPr>
-              <w:t>Причина выбора</w:t>
+              <w:t>Назначение</w:t>
             </w:r>
           </w:p>
         </w:tc>
@@ -14881,7 +14949,7 @@
                 <w:b w:val="0"/>
                 <w:sz w:val="22"/>
               </w:rPr>
-              <w:t>Среда выполнения</w:t>
+              <w:t>Backend</w:t>
             </w:r>
           </w:p>
         </w:tc>
@@ -14902,7 +14970,7 @@
                 <w:b w:val="0"/>
                 <w:sz w:val="22"/>
               </w:rPr>
-              <w:t>OpenJDK 17</w:t>
+              <w:t>Java 17, Spring Boot, Spring MVC</w:t>
             </w:r>
           </w:p>
         </w:tc>
@@ -14923,7 +14991,7 @@
                 <w:b w:val="0"/>
                 <w:sz w:val="22"/>
               </w:rPr>
-              <w:t>Базовый вариант для выбранного семейства Spring Boot; проверяется на helios</w:t>
+              <w:t>REST API, прикладные сервисы, исполняемый JAR</w:t>
             </w:r>
           </w:p>
         </w:tc>
@@ -14949,7 +15017,7 @@
                 <w:b w:val="0"/>
                 <w:sz w:val="22"/>
               </w:rPr>
-              <w:t>Backend</w:t>
+              <w:t>Доступ</w:t>
             </w:r>
           </w:p>
         </w:tc>
@@ -14970,7 +15038,7 @@
                 <w:b w:val="0"/>
                 <w:sz w:val="22"/>
               </w:rPr>
-              <w:t>Spring Boot 3.5.x, Spring MVC</w:t>
+              <w:t>Spring Security, JWT, BCrypt</w:t>
             </w:r>
           </w:p>
         </w:tc>
@@ -14991,7 +15059,7 @@
                 <w:b w:val="0"/>
                 <w:sz w:val="22"/>
               </w:rPr>
-              <w:t>Java/Spring соответствует условию задания; один исполняемый JAR</w:t>
+              <w:t>Аутентификация, проверка ролей, подписки и блокировки</w:t>
             </w:r>
           </w:p>
         </w:tc>
@@ -15017,7 +15085,7 @@
                 <w:b w:val="0"/>
                 <w:sz w:val="22"/>
               </w:rPr>
-              <w:t>Frontend</w:t>
+              <w:t>Данные</w:t>
             </w:r>
           </w:p>
         </w:tc>
@@ -15038,7 +15106,7 @@
                 <w:b w:val="0"/>
                 <w:sz w:val="22"/>
               </w:rPr>
-              <w:t>Thymeleaf, HTML5, CSS, JavaScript</w:t>
+              <w:t>PostgreSQL, Hibernate, Spring Data JPA, JDBC</w:t>
             </w:r>
           </w:p>
         </w:tc>
@@ -15059,7 +15127,7 @@
                 <w:b w:val="0"/>
                 <w:sz w:val="22"/>
               </w:rPr>
-              <w:t>Серверные страницы; Node.js и отдельный frontend-сервер не нужны</w:t>
+              <w:t>Хранение сущностей, транзакции, вызов функций PL/pgSQL</w:t>
             </w:r>
           </w:p>
         </w:tc>
@@ -15085,7 +15153,7 @@
                 <w:b w:val="0"/>
                 <w:sz w:val="22"/>
               </w:rPr>
-              <w:t>Доступ</w:t>
+              <w:t>Миграции</w:t>
             </w:r>
           </w:p>
         </w:tc>
@@ -15106,7 +15174,7 @@
                 <w:b w:val="0"/>
                 <w:sz w:val="22"/>
               </w:rPr>
-              <w:t>Spring Security, серверные сессии</w:t>
+              <w:t>Flyway</w:t>
             </w:r>
           </w:p>
         </w:tc>
@@ -15127,7 +15195,7 @@
                 <w:b w:val="0"/>
                 <w:sz w:val="22"/>
               </w:rPr>
-              <w:t>Проверка ролей и доступа, CSRF, хеширование паролей</w:t>
+              <w:t>Версионированное изменение схемы PostgreSQL</w:t>
             </w:r>
           </w:p>
         </w:tc>
@@ -15153,7 +15221,7 @@
                 <w:b w:val="0"/>
                 <w:sz w:val="22"/>
               </w:rPr>
-              <w:t>Данные</w:t>
+              <w:t>Файлы</w:t>
             </w:r>
           </w:p>
         </w:tc>
@@ -15174,7 +15242,7 @@
                 <w:b w:val="0"/>
                 <w:sz w:val="22"/>
               </w:rPr>
-              <w:t>PostgreSQL, Spring Data JPA, JDBC-драйвер</w:t>
+              <w:t>MinIO, Java SDK MinIO</w:t>
             </w:r>
           </w:p>
         </w:tc>
@@ -15195,7 +15263,7 @@
                 <w:b w:val="0"/>
                 <w:sz w:val="22"/>
               </w:rPr>
-              <w:t>Реляционная модель, ограничения и транзакции</w:t>
+              <w:t>Закрытое объектное хранилище фотографий и материалов</w:t>
             </w:r>
           </w:p>
         </w:tc>
@@ -15221,7 +15289,7 @@
                 <w:b w:val="0"/>
                 <w:sz w:val="22"/>
               </w:rPr>
-              <w:t>Миграции</w:t>
+              <w:t>Frontend</w:t>
             </w:r>
           </w:p>
         </w:tc>
@@ -15242,7 +15310,7 @@
                 <w:b w:val="0"/>
                 <w:sz w:val="22"/>
               </w:rPr>
-              <w:t>Flyway</w:t>
+              <w:t>Next.js, React, TypeScript</w:t>
             </w:r>
           </w:p>
         </w:tc>
@@ -15263,7 +15331,7 @@
                 <w:b w:val="0"/>
                 <w:sz w:val="22"/>
               </w:rPr>
-              <w:t>Версионированное создание и изменение схемы</w:t>
+              <w:t>Страницы, формы и взаимодействие с REST API</w:t>
             </w:r>
           </w:p>
         </w:tc>
@@ -15289,7 +15357,7 @@
                 <w:b w:val="0"/>
                 <w:sz w:val="22"/>
               </w:rPr>
-              <w:t>Сборка</w:t>
+              <w:t>Состояние клиента</w:t>
             </w:r>
           </w:p>
         </w:tc>
@@ -15310,7 +15378,7 @@
                 <w:b w:val="0"/>
                 <w:sz w:val="22"/>
               </w:rPr>
-              <w:t>Maven Wrapper</w:t>
+              <w:t>Redux Toolkit, React Redux</w:t>
             </w:r>
           </w:p>
         </w:tc>
@@ -15331,7 +15399,7 @@
                 <w:b w:val="0"/>
                 <w:sz w:val="22"/>
               </w:rPr>
-              <w:t>Воспроизводимая сборка вне helios</w:t>
+              <w:t>Состояние интерфейса и результаты запросов</w:t>
             </w:r>
           </w:p>
         </w:tc>
@@ -15357,7 +15425,7 @@
                 <w:b w:val="0"/>
                 <w:sz w:val="22"/>
               </w:rPr>
-              <w:t>Проверки</w:t>
+              <w:t>Компоненты интерфейса</w:t>
             </w:r>
           </w:p>
         </w:tc>
@@ -15378,7 +15446,7 @@
                 <w:b w:val="0"/>
                 <w:sz w:val="22"/>
               </w:rPr>
-              <w:t>JUnit, Spring Test, интеграционные проверки на PostgreSQL</w:t>
+              <w:t>Tailwind CSS, Radix UI/shadcn</w:t>
             </w:r>
           </w:p>
         </w:tc>
@@ -15399,7 +15467,7 @@
                 <w:b w:val="0"/>
                 <w:sz w:val="22"/>
               </w:rPr>
-              <w:t>Проверка бизнес-правил и конкурентных операций</w:t>
+              <w:t>Адаптивная вёрстка и элементы форм</w:t>
             </w:r>
           </w:p>
         </w:tc>
@@ -15425,7 +15493,7 @@
                 <w:b w:val="0"/>
                 <w:sz w:val="22"/>
               </w:rPr>
-              <w:t>Файлы</w:t>
+              <w:t>Сборка</w:t>
             </w:r>
           </w:p>
         </w:tc>
@@ -15446,7 +15514,7 @@
                 <w:b w:val="0"/>
                 <w:sz w:val="22"/>
               </w:rPr>
-              <w:t>Каталог в домашней директории пользователя</w:t>
+              <w:t>Gradle Wrapper, Node.js, pnpm</w:t>
             </w:r>
           </w:p>
         </w:tc>
@@ -15467,7 +15535,143 @@
                 <w:b w:val="0"/>
                 <w:sz w:val="22"/>
               </w:rPr>
-              <w:t>Нет обязательного S3, файлы выдаются через проверяющий права контроллер</w:t>
+              <w:t>Сборка backend и frontend на машине разработчика</w:t>
+            </w:r>
+          </w:p>
+        </w:tc>
+      </w:tr>
+      <w:tr>
+        <w:trPr>
+          <w:cantSplit/>
+        </w:trPr>
+        <w:tc>
+          <w:tcPr>
+            <w:tcW w:type="dxa" w:w="2619"/>
+          </w:tcPr>
+          <w:p>
+            <w:pPr>
+              <w:keepNext w:val="0"/>
+              <w:spacing w:line="240" w:lineRule="auto" w:after="80" w:before="60"/>
+              <w:ind w:firstLine="0"/>
+              <w:jc w:val="left"/>
+            </w:pPr>
+            <w:r>
+              <w:rPr>
+                <w:rFonts w:ascii="Times New Roman" w:hAnsi="Times New Roman"/>
+                <w:b w:val="0"/>
+                <w:sz w:val="22"/>
+              </w:rPr>
+              <w:t>Вспомогательные средства</w:t>
+            </w:r>
+          </w:p>
+        </w:tc>
+        <w:tc>
+          <w:tcPr>
+            <w:tcW w:type="dxa" w:w="2993"/>
+          </w:tcPr>
+          <w:p>
+            <w:pPr>
+              <w:keepNext w:val="0"/>
+              <w:spacing w:line="240" w:lineRule="auto" w:after="80" w:before="60"/>
+              <w:ind w:firstLine="0"/>
+              <w:jc w:val="left"/>
+            </w:pPr>
+            <w:r>
+              <w:rPr>
+                <w:rFonts w:ascii="Times New Roman" w:hAnsi="Times New Roman"/>
+                <w:b w:val="0"/>
+                <w:sz w:val="22"/>
+              </w:rPr>
+              <w:t>Lombok, MapStruct, Springdoc OpenAPI</w:t>
+            </w:r>
+          </w:p>
+        </w:tc>
+        <w:tc>
+          <w:tcPr>
+            <w:tcW w:type="dxa" w:w="3742"/>
+          </w:tcPr>
+          <w:p>
+            <w:pPr>
+              <w:keepNext w:val="0"/>
+              <w:spacing w:line="240" w:lineRule="auto" w:after="80" w:before="60"/>
+              <w:ind w:firstLine="0"/>
+              <w:jc w:val="left"/>
+            </w:pPr>
+            <w:r>
+              <w:rPr>
+                <w:rFonts w:ascii="Times New Roman" w:hAnsi="Times New Roman"/>
+                <w:b w:val="0"/>
+                <w:sz w:val="22"/>
+              </w:rPr>
+              <w:t>Модели, преобразование DTO, описание REST API</w:t>
+            </w:r>
+          </w:p>
+        </w:tc>
+      </w:tr>
+      <w:tr>
+        <w:trPr>
+          <w:cantSplit/>
+        </w:trPr>
+        <w:tc>
+          <w:tcPr>
+            <w:tcW w:type="dxa" w:w="2619"/>
+          </w:tcPr>
+          <w:p>
+            <w:pPr>
+              <w:keepNext w:val="0"/>
+              <w:spacing w:line="240" w:lineRule="auto" w:after="80" w:before="60"/>
+              <w:ind w:firstLine="0"/>
+              <w:jc w:val="left"/>
+            </w:pPr>
+            <w:r>
+              <w:rPr>
+                <w:rFonts w:ascii="Times New Roman" w:hAnsi="Times New Roman"/>
+                <w:b w:val="0"/>
+                <w:sz w:val="22"/>
+              </w:rPr>
+              <w:t>Проверки</w:t>
+            </w:r>
+          </w:p>
+        </w:tc>
+        <w:tc>
+          <w:tcPr>
+            <w:tcW w:type="dxa" w:w="2993"/>
+          </w:tcPr>
+          <w:p>
+            <w:pPr>
+              <w:keepNext w:val="0"/>
+              <w:spacing w:line="240" w:lineRule="auto" w:after="80" w:before="60"/>
+              <w:ind w:firstLine="0"/>
+              <w:jc w:val="left"/>
+            </w:pPr>
+            <w:r>
+              <w:rPr>
+                <w:rFonts w:ascii="Times New Roman" w:hAnsi="Times New Roman"/>
+                <w:b w:val="0"/>
+                <w:sz w:val="22"/>
+              </w:rPr>
+              <w:t>JUnit, Spring Test, Spring Security Test</w:t>
+            </w:r>
+          </w:p>
+        </w:tc>
+        <w:tc>
+          <w:tcPr>
+            <w:tcW w:type="dxa" w:w="3742"/>
+          </w:tcPr>
+          <w:p>
+            <w:pPr>
+              <w:keepNext w:val="0"/>
+              <w:spacing w:line="240" w:lineRule="auto" w:after="80" w:before="60"/>
+              <w:ind w:firstLine="0"/>
+              <w:jc w:val="left"/>
+            </w:pPr>
+            <w:r>
+              <w:rPr>
+                <w:rFonts w:ascii="Times New Roman" w:hAnsi="Times New Roman"/>
+                <w:b w:val="0"/>
+                <w:sz w:val="22"/>
+              </w:rPr>
+              <w:t>Проверка правил, доступа и взаимодействия с PostgreSQL</w:t>
             </w:r>
           </w:p>
         </w:tc>
@@ -15483,7 +15687,23 @@
         <w:rPr>
           <w:b w:val="0"/>
         </w:rPr>
-        <w:t>Spring Boot 3.5 требует Java не ниже 17 и поддерживает встроенный Tomcat. Минимальная поддерживаемая версия Maven — 3.6.3 [5]. Версии зависимостей фиксируются в pom.xml при реализации. Перед сборкой и развёртыванием проверяется совместимость выбранной JVM с окружением helios.</w:t>
+        <w:t>В отчёте MyFilmList среди средств интерфейса указан Next UI; фактический package.json этой версии содержит Tailwind CSS и Radix UI, а компоненты организованы по подходу shadcn [8]. Для «Потеряшек» принят вариант из исходного кода. Набор технологий сохраняется, а конкретные поддерживаемые версии зависимостей фиксируются в build.gradle и pnpm-lock.yaml при реализации. Для backend рассматривается семейство Spring Boot 3.5, совместимое с Java 17 [5].</w:t>
+      </w:r>
+    </w:p>
+    <w:p>
+      <w:r>
+        <w:rPr>
+          <w:b w:val="0"/>
+        </w:rPr>
+        <w:t>Для демонстрации frontend собирается в режиме статического экспорта Next.js: HTML, CSS и JavaScript включаются в ресурсы Spring-приложения [9]. Данные загружаются из REST API клиентскими компонентами. Серверный рендеринг по запросу, Server Actions и другие возможности, требующие Node.js-сервера, в этой конфигурации не используются. Страницы карточек получают ID через параметры запроса, поэтому добавление новой находки не требует повторной сборки frontend. Клиент и API доступны с одного адреса; отдельный Node.js-процесс на helios не нужен. Spring MVC сопоставляет маршруты страниц с экспортированными HTML-файлами; обработчики REST API и статических ресурсов _next работают отдельно.</w:t>
+      </w:r>
+    </w:p>
+    <w:p>
+      <w:r>
+        <w:rPr>
+          <w:b w:val="0"/>
+        </w:rPr>
+        <w:t>Access-токен JWT имеет ограниченный срок действия и хранится в памяти клиента без сохранения в localStorage. Refresh-токен передаётся в защищённой Cookie, его хеш хранится в БД; при обновлении выполняется ротация. Выход и смена пароля отзывают refresh-токены, а версия токенов аккаунта позволяет аннулировать ранее выданные JWT. Состояние блокировки и подписки проверяется на backend независимо от содержимого токена. Операции обновления и выхода, использующие Cookie, защищаются от CSRF.</w:t>
       </w:r>
     </w:p>
     <w:p>
@@ -15737,7 +15957,7 @@
         <w:rPr>
           <w:b w:val="0"/>
         </w:rPr>
-        <w:t>В каждом модуле выделяются MVC-контроллеры, прикладные сервисы, доменные сущности и репозитории. Контроллер принимает запрос и проверяет формат, сервис применяет бизнес-правила и транзакции, репозиторий обращается к БД. Проверка подписки выполняется на сервере, а не только посредством скрытия кнопок. Внешние зависимости доступны через интерфейсы адаптеров, чтобы учебный режим не менял основную логику.</w:t>
+        <w:t>В каждом модуле выделяются MVC-контроллеры, прикладные сервисы, доменные сущности и репозитории. REST-контроллер принимает запрос и проверяет формат, сервис применяет бизнес-правила и транзакции, репозиторий обращается к БД. Проверка подписки выполняется на сервере, а не только посредством скрытия кнопок. Внешние зависимости доступны через интерфейсы адаптеров, чтобы учебный режим не менял основную логику.</w:t>
       </w:r>
     </w:p>
     <w:p>
@@ -15753,7 +15973,7 @@
         <w:rPr>
           <w:b w:val="0"/>
         </w:rPr>
-        <w:t>Предлагаются таблицы users, roles, user_roles, verifications, subscriptions, payment_orders, payment_events, listings, listing_images, private_attributes, locations, organizations, claims, conversations, messages, transfers, complaints, auction_permissions, auctions, bids, notifications, outbox_events и audit_entries. Используются внешние ключи, уникальность email и внешнего ID платёжного события, проверки сумм и временных интервалов. Доступ к закрытым данным осуществляется через сервисы с проверкой участников.</w:t>
+        <w:t>Предлагаются таблицы users, roles, user_roles, refresh_tokens, verifications, subscriptions, payment_orders, payment_events, listings, listing_images, private_attributes, locations, organizations, claims, conversations, messages, transfers, complaints, auction_permissions, auctions, bids, notifications, outbox_events и audit_entries. Используются внешние ключи, уникальность email и внешнего ID платёжного события, проверки сумм и временных интервалов. Доступ к закрытым данным осуществляется через сервисы с проверкой участников.</w:t>
       </w:r>
     </w:p>
     <w:p>
@@ -15777,7 +15997,7 @@
         <w:rPr>
           <w:b w:val="0"/>
         </w:rPr>
-        <w:t>Критически важные операции — резервирование находки, приём ставки, завершение аукциона и активация подписки — предусматриваются как функции PL/pgSQL. Их определения, ограничения целостности, триггеры и тестовые данные разрабатываются на втором этапе. На третьем этапе слой хранения вызывает эти функции через JDBC или нативные запросы JPA; повторная реализация тех же операций в Java не требуется. Прикладные сервисы отвечают за проверку доступа, подготовку параметров и обработку результата. Связь пользователей и ролей моделируется отдельной таблицей user_roles и образует отношение «многие ко многим».</w:t>
+        <w:t>Критически важные операции — резервирование находки, приём ставки, завершение аукциона и активация подписки — предусматриваются как функции PL/pgSQL. Их определения, ограничения целостности, триггеры и тестовые данные разрабатываются на втором этапе. На третьем этапе слой хранения вызывает эти функции через JDBC или нативные запросы JPA; замена таких вызовов аналогичной реализацией в Java не допускается. Прикладные сервисы отвечают за проверку доступа, подготовку параметров и обработку результата. Связь пользователей и ролей моделируется отдельной таблицей user_roles и образует отношение «многие ко многим».</w:t>
       </w:r>
     </w:p>
     <w:p>
@@ -15793,7 +16013,7 @@
         <w:rPr>
           <w:b w:val="0"/>
         </w:rPr>
-        <w:t>Файлы сохраняются под генерируемыми именами вне публичного каталога. Изображения декодируются, проверяются и пересохраняются без EXIF; закрытые материалы выдаются только через авторизованный контроллер. При сбое между сохранением файла и БД временные файлы очищаются фоновым заданием. Копия для восстановления включает БД и файловое хранилище.</w:t>
+        <w:t>Фотографии и подтверждающие материалы сохраняются в закрытом бакете MinIO под генерируемыми ключами. В PostgreSQL хранятся ключ объекта, тип, размер и права доступа. Изображения декодируются, проверяются и пересохраняются без EXIF. Spring-контроллер проверяет права и передаёт содержимое объекта пользователю; публичный доступ к бакету закрыт. Временные объекты, не связанные с записью БД после сбоя, удаляются фоновым заданием. Резервное копирование включает PostgreSQL и объекты MinIO.</w:t>
       </w:r>
     </w:p>
     <w:p>
@@ -15857,7 +16077,7 @@
         <w:rPr>
           <w:b w:val="0"/>
         </w:rPr>
-        <w:t>Предварительная проверка проводится в собственной учебной учётной записи: uname -a и java -version, доступность PostgreSQL, наличие прав на свою схему, свободный непривилегированный порт и место для файлов. Если Java 17 отсутствует, необходимо проверить допустимость пользовательской установки совместимой JVM для фактической ОС и архитектуры. Нельзя считать произвольный Linux-дистрибутив JDK совместимым с helios. Если подходящая JVM недоступна, стек должен быть пересмотрен до написания приложения.</w:t>
+        <w:t>Перед развёртыванием проверяются ОС и архитектура helios, доступность Java 17, выделенной схемы PostgreSQL, порта приложения и адреса MinIO. Если на сервере нет подходящей JVM, проверяется возможность пользовательской установки для фактической ОС. PostgreSQL используется в выделенной схеме; MinIO развёртывается на отдельной доступной машине. В локальной среде PostgreSQL, MinIO и почтовый стенд могут запускаться через Docker Compose, как в MyFilmList.</w:t>
       </w:r>
     </w:p>
     <w:p>
@@ -15865,7 +16085,7 @@
         <w:rPr>
           <w:b w:val="0"/>
         </w:rPr>
-        <w:t>Сборка выполняется локально командой ./mvnw clean verify; на сервер передаются исполняемый JAR, конфигурация и миграции. В домашнем каталоге создаются ~/poteryashki/app, ~/poteryashki/config, ~/poteryashki/files, ~/poteryashki/logs и ~/poteryashki/backups. Адрес PostgreSQL, имя БД и схема берутся из выделенных параметров; использовать конкретный хост или базу без проверки не предполагается. Изменения выполняются только в собственной схеме.</w:t>
+        <w:t>Frontend собирается локально командами pnpm install --frozen-lockfile и pnpm build из каталога client. В конфигурации Next.js задаётся output: 'export'; полученный каталог out включается в src/main/resources/static backend. Затем Gradle Wrapper выполняет ./gradlew clean test bootJar. На helios передаются JAR, конфигурация и миграции. Сборка frontend выполняется на машине с поддерживаемой версией Node.js; установка Node.js на helios для этого режима не требуется.</w:t>
       </w:r>
     </w:p>
     <w:p>
@@ -15873,7 +16093,7 @@
         <w:rPr>
           <w:b w:val="0"/>
         </w:rPr>
-        <w:t>Пример запуска после подстановки своих путей и выделенного порта: java -Xms128m -Xmx256m -jar poteryashki.jar --spring.profiles.active=demo --server.address=127.0.0.1 --server.port=PORT. PORT — параметр, который требуется заменить числом; пример не является готовой командой для запуска без настройки. Учётные данные БД передаются через защищённый конфигурационный файл или окружение, не через аргументы командной строки. Предел памяти 256 МБ — исходный ориентир, проверяемый по фактической квоте и нагрузке.</w:t>
+        <w:t>В домашнем каталоге создаются ~/poteryashki/app, ~/poteryashki/config, ~/poteryashki/logs и ~/poteryashki/backups. Адрес PostgreSQL, схема, endpoint MinIO, имя бакета и параметры почты задаются через конфигурацию. Пароли, ключи JWT и учётные данные MinIO не включаются в репозиторий и не передаются в аргументах командной строки. Копия для восстановления включает БД и объекты бакета.</w:t>
       </w:r>
     </w:p>
     <w:p>
@@ -15881,7 +16101,7 @@
         <w:rPr>
           <w:b w:val="0"/>
         </w:rPr>
-        <w:t>Для просмотра используется SSH-перенаправление локального порта: ssh -L 18080:127.0.0.1:PORT USER@HOST. HOST, USER, SSH-порт и PORT берутся из учебных параметров; если SSH использует нестандартный порт, добавляется -p SSH_PORT. Браузер преподавателя открывает http://127.0.0.1:18080; запросы через туннель обслуживает JVM на helios. При доступном кафедральном HTTPS-прокси можно использовать его вместо туннеля.</w:t>
+        <w:t>Пример запуска после настройки порта: java -Xms128m -Xmx256m -jar poteryashki.jar --spring.profiles.active=demo --server.address=127.0.0.1 --server.port=PORT. Значение PORT заменяется выделенным числом, предел памяти проверяется по квоте и результатам запуска. Для просмотра используется SSH-перенаправление: ssh -L 18080:127.0.0.1:PORT USER@HOST. Если SSH работает на нестандартном порту, добавляется -p SSH_PORT. Браузер открывает http://127.0.0.1:18080; статический интерфейс и REST API обслуживаются приложением на helios.</w:t>
       </w:r>
     </w:p>
     <w:p>
@@ -15889,7 +16109,15 @@
         <w:rPr>
           <w:b w:val="0"/>
         </w:rPr>
-        <w:t>Docker, системный Tomcat, root и отдельный Node.js-процесс не обязательны. PostgreSQL используется выделенный, а не устанавливается от имени администратора сервера. Отказ внешнего сайта метро и отсутствие реального эквайринга не мешают демонстрации справочника и учебного платёжного адаптера. По окончании показа приложение останавливается, временные данные очищаются в своей схеме, резервная копия сохраняется при необходимости.</w:t>
+        <w:t>Если MinIO расположен на машине разработчика и недоступен с helios напрямую, для демонстрации может использоваться разрешённое сервером обратное SSH-перенаправление его API-порта. В этом случае backend обращается к endpoint на loopback-адресе helios. Доступность MinIO и возможность такого перенаправления проверяются до показа; работоспособность загрузки, чтения и резервного копирования объектов входит в подготовку стенда. Запуск самого MinIO на helios не предполагается без проверки совместимости.</w:t>
+      </w:r>
+    </w:p>
+    <w:p>
+      <w:r>
+        <w:rPr>
+          <w:b w:val="0"/>
+        </w:rPr>
+        <w:t>Тестовый платёжный адаптер работает внутри backend, а справочник метро читается из PostgreSQL. При завершении демонстрации приложение и временные туннели останавливаются. Выделенная схема PostgreSQL и бакет MinIO управляются только в пределах предоставленных прав.</w:t>
       </w:r>
     </w:p>
     <w:p>
@@ -16012,7 +16240,7 @@
         <w:rPr>
           <w:b w:val="0"/>
         </w:rPr>
-        <w:t>Определена предметная область ИС «Потеряшки», описаны процессы публикации, поиска, возврата, подписки, модерации, справочной интеграции с метро и аукциона. Сформулированы проверяемые требования и бизнес-правила, построены модели основных прецедентов и даны их сценарии. Предложена архитектура на Spring MVC, Thymeleaf и PostgreSQL с развёртыванием в одном Java-процессе на helios.</w:t>
+        <w:t>Определена предметная область ИС «Потеряшки», описаны процессы публикации, поиска, возврата, подписки, модерации, справочной интеграции с метро и аукциона. Сформулированы проверяемые требования и бизнес-правила, построены модели основных прецедентов и даны их сценарии. Предложена клиент-серверная архитектура: Next.js, TypeScript и Redux на frontend, Java 17 и Spring Boot на backend, PostgreSQL для структурированных данных и MinIO для файлов. На helios размещаются Spring-приложение и статическая сборка интерфейса.</w:t>
       </w:r>
     </w:p>
     <w:p>
@@ -16107,6 +16335,39 @@
     </w:p>
     <w:p>
       <w:pPr>
+        <w:ind w:firstLine="0" w:left="227"/>
+      </w:pPr>
+      <w:r>
+        <w:rPr>
+          <w:b w:val="0"/>
+        </w:rPr>
+        <w:t>7. MyFilmList. Backend, build.gradle, версия 74d1928973cae329d6ca651bac2ffde445a43de0: https://github.com/maxbarsukov/MyFilmList/blob/74d1928973cae329d6ca651bac2ffde445a43de0/build.gradle</w:t>
+      </w:r>
+    </w:p>
+    <w:p>
+      <w:pPr>
+        <w:ind w:firstLine="0" w:left="227"/>
+      </w:pPr>
+      <w:r>
+        <w:rPr>
+          <w:b w:val="0"/>
+        </w:rPr>
+        <w:t>8. MyFilmList. Frontend, client/package.json, та же версия: https://github.com/maxbarsukov/MyFilmList/blob/74d1928973cae329d6ca651bac2ffde445a43de0/client/package.json</w:t>
+      </w:r>
+    </w:p>
+    <w:p>
+      <w:pPr>
+        <w:ind w:firstLine="0" w:left="227"/>
+      </w:pPr>
+      <w:r>
+        <w:rPr>
+          <w:b w:val="0"/>
+        </w:rPr>
+        <w:t>9. Next.js. Static Exports. Официальная документация: https://nextjs.org/docs/app/guides/static-exports</w:t>
+      </w:r>
+    </w:p>
+    <w:p>
+      <w:pPr>
         <w:pStyle w:val="Heading1"/>
       </w:pPr>
       <w:r>
@@ -17145,7 +17406,7 @@
                 <w:b w:val="0"/>
                 <w:sz w:val="22"/>
               </w:rPr>
-              <w:t>Модульный монолит, Spring MVC/Thymeleaf/PostgreSQL, план развёртывания</w:t>
+              <w:t>Next.js/TypeScript/Redux, Spring Boot/Hibernate, PostgreSQL/MinIO; план развёртывания</w:t>
             </w:r>
           </w:p>
         </w:tc>

</xml_diff>